<commit_message>
machine learning opdrachten aangepast
</commit_message>
<xml_diff>
--- a/ML uitleg/ML samenvatting.docx
+++ b/ML uitleg/ML samenvatting.docx
@@ -1701,6 +1701,7 @@
     </w:p>
     <w:p>
       <w:r>
+        <w:lastRenderedPageBreak/>
         <w:t>Garage → omgezet naar:</w:t>
       </w:r>
     </w:p>
@@ -2024,18 +2025,20 @@
       </w:r>
     </w:p>
     <w:p/>
-    <w:p>
-      <w:pPr>
-        <w:rPr>
-          <w:b/>
-          <w:bCs/>
-        </w:rPr>
-      </w:pPr>
-      <w:r>
-        <w:rPr>
-          <w:b/>
-          <w:bCs/>
-        </w:rPr>
+    <w:p/>
+    <w:p>
+      <w:pPr>
+        <w:rPr>
+          <w:b/>
+          <w:bCs/>
+        </w:rPr>
+      </w:pPr>
+      <w:r>
+        <w:rPr>
+          <w:b/>
+          <w:bCs/>
+        </w:rPr>
+        <w:lastRenderedPageBreak/>
         <w:t xml:space="preserve"> Stap 7 – Evaluatie</w:t>
       </w:r>
     </w:p>
@@ -2375,6 +2378,7 @@
     </w:p>
     <w:p>
       <w:r>
+        <w:lastRenderedPageBreak/>
         <w:t>Modelcomplexiteit moet in balans zijn met generalisatie.</w:t>
       </w:r>
     </w:p>
@@ -2719,6 +2723,7 @@
           <w:b/>
           <w:bCs/>
         </w:rPr>
+        <w:lastRenderedPageBreak/>
         <w:t>Antwoord:</w:t>
       </w:r>
       <w:r>
@@ -3231,6 +3236,7 @@
           <w:p>
             <w:proofErr w:type="spellStart"/>
             <w:r>
+              <w:lastRenderedPageBreak/>
               <w:t>OneHotEncoder</w:t>
             </w:r>
             <w:proofErr w:type="spellEnd"/>
@@ -3765,6 +3771,7 @@
           </w:tcPr>
           <w:p>
             <w:r>
+              <w:lastRenderedPageBreak/>
               <w:t>Underfitting</w:t>
             </w:r>
           </w:p>
@@ -4263,6 +4270,7 @@
           <w:b/>
           <w:bCs/>
         </w:rPr>
+        <w:lastRenderedPageBreak/>
         <w:t>Stap 1 – Dataset inlezen</w:t>
       </w:r>
     </w:p>
@@ -4499,7 +4507,6 @@
         </w:numPr>
       </w:pPr>
       <w:r>
-        <w:lastRenderedPageBreak/>
         <w:t>Alle features heb ik geschaald met </w:t>
       </w:r>
       <w:proofErr w:type="spellStart"/>
@@ -4644,6 +4651,7 @@
           <w:b/>
           <w:bCs/>
         </w:rPr>
+        <w:lastRenderedPageBreak/>
         <w:t xml:space="preserve"> Stap 5 – Experimenteren</w:t>
       </w:r>
     </w:p>
@@ -4807,7 +4815,6 @@
     </w:p>
     <w:p>
       <w:r>
-        <w:lastRenderedPageBreak/>
         <w:t>Waarom? → Om niet alleen naar één score te kijken, maar ook visueel te beoordelen of clusters logisch gescheiden zijn.</w:t>
       </w:r>
     </w:p>
@@ -4931,7 +4938,11 @@
       </w:r>
       <w:proofErr w:type="spellEnd"/>
       <w:r>
-        <w:t>. Vervolgens heb ik op basis van de Data Dictionary drie features gekozen waarvan ik verwachtte dat ze huizen goed onderscheiden: woonoppervlak, algemene kwaliteit en buurt. Hierbij heb ik bewust een categorische feature meegenomen.</w:t>
+        <w:t xml:space="preserve">. Vervolgens heb ik op basis van de Data Dictionary drie features gekozen waarvan ik verwachtte dat ze huizen </w:t>
+      </w:r>
+      <w:r>
+        <w:lastRenderedPageBreak/>
+        <w:t>goed onderscheiden: woonoppervlak, algemene kwaliteit en buurt. Hierbij heb ik bewust een categorische feature meegenomen.</w:t>
       </w:r>
     </w:p>
     <w:p>
@@ -5045,6 +5056,152 @@
           <w:bCs/>
         </w:rPr>
         <w:t xml:space="preserve"> 1. Waarom heb je K-Means gekozen?</w:t>
+      </w:r>
+    </w:p>
+    <w:p>
+      <w:r>
+        <w:rPr>
+          <w:b/>
+          <w:bCs/>
+        </w:rPr>
+        <w:t>Antwoord:</w:t>
+      </w:r>
+      <w:r>
+        <w:t xml:space="preserve"> Omdat K-Means geschikt is voor het groeperen van objecten </w:t>
+      </w:r>
+      <w:proofErr w:type="spellStart"/>
+      <w:r>
+        <w:t>o</w:t>
+      </w:r>
+      <w:r>
+        <w:t>sil</w:t>
+      </w:r>
+      <w:r>
+        <w:t>p</w:t>
+      </w:r>
+      <w:proofErr w:type="spellEnd"/>
+      <w:r>
+        <w:t xml:space="preserve"> basis van afstand in feature-ruimte. Het is efficiënt bij grotere datasets en goed interpreteerbaar via clustercentra.</w:t>
+      </w:r>
+    </w:p>
+    <w:p/>
+    <w:p>
+      <w:pPr>
+        <w:rPr>
+          <w:b/>
+          <w:bCs/>
+        </w:rPr>
+      </w:pPr>
+      <w:r>
+        <w:rPr>
+          <w:b/>
+          <w:bCs/>
+        </w:rPr>
+        <w:t xml:space="preserve"> 2. Waarom moest je schalen?</w:t>
+      </w:r>
+    </w:p>
+    <w:p>
+      <w:r>
+        <w:rPr>
+          <w:b/>
+          <w:bCs/>
+        </w:rPr>
+        <w:t>Antwoord:</w:t>
+      </w:r>
+      <w:r>
+        <w:t xml:space="preserve"> K-Means gebruikt Euclidische afstand. Zonder schalen zou een feature zoals woonoppervlak veel zwaarder wegen dan bijvoorbeeld kwaliteitsscore. </w:t>
+      </w:r>
+      <w:proofErr w:type="spellStart"/>
+      <w:r>
+        <w:t>StandardScaler</w:t>
+      </w:r>
+      <w:proofErr w:type="spellEnd"/>
+      <w:r>
+        <w:t xml:space="preserve"> zorgt dat alle features even zwaar meetellen.</w:t>
+      </w:r>
+    </w:p>
+    <w:p/>
+    <w:p>
+      <w:pPr>
+        <w:rPr>
+          <w:b/>
+          <w:bCs/>
+        </w:rPr>
+      </w:pPr>
+      <w:r>
+        <w:rPr>
+          <w:b/>
+          <w:bCs/>
+        </w:rPr>
+        <w:t xml:space="preserve"> 3. Waarom </w:t>
+      </w:r>
+      <w:proofErr w:type="spellStart"/>
+      <w:r>
+        <w:rPr>
+          <w:b/>
+          <w:bCs/>
+        </w:rPr>
+        <w:t>one</w:t>
+      </w:r>
+      <w:proofErr w:type="spellEnd"/>
+      <w:r>
+        <w:rPr>
+          <w:b/>
+          <w:bCs/>
+        </w:rPr>
+        <w:t xml:space="preserve">-hot </w:t>
+      </w:r>
+      <w:proofErr w:type="spellStart"/>
+      <w:r>
+        <w:rPr>
+          <w:b/>
+          <w:bCs/>
+        </w:rPr>
+        <w:t>encoding</w:t>
+      </w:r>
+      <w:proofErr w:type="spellEnd"/>
+      <w:r>
+        <w:rPr>
+          <w:b/>
+          <w:bCs/>
+        </w:rPr>
+        <w:t>?</w:t>
+      </w:r>
+    </w:p>
+    <w:p>
+      <w:r>
+        <w:rPr>
+          <w:b/>
+          <w:bCs/>
+        </w:rPr>
+        <w:t>Antwoord:</w:t>
+      </w:r>
+      <w:r>
+        <w:t xml:space="preserve"> K-Means kan alleen numerieke waarden verwerken. </w:t>
+      </w:r>
+      <w:proofErr w:type="spellStart"/>
+      <w:r>
+        <w:t>Neighborhood</w:t>
+      </w:r>
+      <w:proofErr w:type="spellEnd"/>
+      <w:r>
+        <w:t xml:space="preserve"> is categorisch, dus moest worden omgezet naar numerieke dummy-variabelen zonder rangorde te introduceren.</w:t>
+      </w:r>
+    </w:p>
+    <w:p/>
+    <w:p>
+      <w:pPr>
+        <w:rPr>
+          <w:b/>
+          <w:bCs/>
+        </w:rPr>
+      </w:pPr>
+      <w:r>
+        <w:rPr>
+          <w:b/>
+          <w:bCs/>
+        </w:rPr>
+        <w:t xml:space="preserve"> 4. Hoe heb je het optimale aantal clusters bepaald?</w:t>
       </w:r>
     </w:p>
     <w:p>
@@ -5057,138 +5214,6 @@
         <w:t>Antwoord:</w:t>
       </w:r>
       <w:r>
-        <w:t> Omdat K-Means geschikt is voor het groeperen van objecten op basis van afstand in feature-ruimte. Het is efficiënt bij grotere datasets en goed interpreteerbaar via clustercentra.</w:t>
-      </w:r>
-    </w:p>
-    <w:p/>
-    <w:p>
-      <w:pPr>
-        <w:rPr>
-          <w:b/>
-          <w:bCs/>
-        </w:rPr>
-      </w:pPr>
-      <w:r>
-        <w:rPr>
-          <w:b/>
-          <w:bCs/>
-        </w:rPr>
-        <w:t xml:space="preserve"> 2. Waarom moest je schalen?</w:t>
-      </w:r>
-    </w:p>
-    <w:p>
-      <w:r>
-        <w:rPr>
-          <w:b/>
-          <w:bCs/>
-        </w:rPr>
-        <w:t>Antwoord:</w:t>
-      </w:r>
-      <w:r>
-        <w:t xml:space="preserve"> K-Means gebruikt Euclidische afstand. Zonder schalen zou een feature zoals woonoppervlak veel zwaarder wegen dan bijvoorbeeld kwaliteitsscore. </w:t>
-      </w:r>
-      <w:proofErr w:type="spellStart"/>
-      <w:r>
-        <w:t>StandardScaler</w:t>
-      </w:r>
-      <w:proofErr w:type="spellEnd"/>
-      <w:r>
-        <w:t xml:space="preserve"> zorgt dat alle features even zwaar meetellen.</w:t>
-      </w:r>
-    </w:p>
-    <w:p/>
-    <w:p>
-      <w:pPr>
-        <w:rPr>
-          <w:b/>
-          <w:bCs/>
-        </w:rPr>
-      </w:pPr>
-      <w:r>
-        <w:rPr>
-          <w:b/>
-          <w:bCs/>
-        </w:rPr>
-        <w:t xml:space="preserve"> 3. Waarom </w:t>
-      </w:r>
-      <w:proofErr w:type="spellStart"/>
-      <w:r>
-        <w:rPr>
-          <w:b/>
-          <w:bCs/>
-        </w:rPr>
-        <w:t>one</w:t>
-      </w:r>
-      <w:proofErr w:type="spellEnd"/>
-      <w:r>
-        <w:rPr>
-          <w:b/>
-          <w:bCs/>
-        </w:rPr>
-        <w:t xml:space="preserve">-hot </w:t>
-      </w:r>
-      <w:proofErr w:type="spellStart"/>
-      <w:r>
-        <w:rPr>
-          <w:b/>
-          <w:bCs/>
-        </w:rPr>
-        <w:t>encoding</w:t>
-      </w:r>
-      <w:proofErr w:type="spellEnd"/>
-      <w:r>
-        <w:rPr>
-          <w:b/>
-          <w:bCs/>
-        </w:rPr>
-        <w:t>?</w:t>
-      </w:r>
-    </w:p>
-    <w:p>
-      <w:r>
-        <w:rPr>
-          <w:b/>
-          <w:bCs/>
-        </w:rPr>
-        <w:t>Antwoord:</w:t>
-      </w:r>
-      <w:r>
-        <w:t xml:space="preserve"> K-Means kan alleen numerieke waarden verwerken. </w:t>
-      </w:r>
-      <w:proofErr w:type="spellStart"/>
-      <w:r>
-        <w:t>Neighborhood</w:t>
-      </w:r>
-      <w:proofErr w:type="spellEnd"/>
-      <w:r>
-        <w:t xml:space="preserve"> is categorisch, dus moest worden omgezet naar numerieke dummy-variabelen zonder rangorde te introduceren.</w:t>
-      </w:r>
-    </w:p>
-    <w:p/>
-    <w:p>
-      <w:pPr>
-        <w:rPr>
-          <w:b/>
-          <w:bCs/>
-        </w:rPr>
-      </w:pPr>
-      <w:r>
-        <w:rPr>
-          <w:b/>
-          <w:bCs/>
-        </w:rPr>
-        <w:t xml:space="preserve"> 4. Hoe heb je het optimale aantal clusters bepaald?</w:t>
-      </w:r>
-    </w:p>
-    <w:p>
-      <w:r>
-        <w:rPr>
-          <w:b/>
-          <w:bCs/>
-        </w:rPr>
-        <w:t>Antwoord:</w:t>
-      </w:r>
-      <w:r>
         <w:t xml:space="preserve"> Met de </w:t>
       </w:r>
       <w:proofErr w:type="spellStart"/>
@@ -5327,7 +5352,6 @@
     </w:p>
     <w:p>
       <w:r>
-        <w:lastRenderedPageBreak/>
         <w:t>De PCA-visualisatie bevestigde deze bevindingen visueel: bij betere featurecombinaties waren clusters duidelijker gescheiden in de 2D-projectie.</w:t>
       </w:r>
     </w:p>
@@ -5569,6 +5593,7 @@
           </w:tcPr>
           <w:p>
             <w:r>
+              <w:lastRenderedPageBreak/>
               <w:t>Cluster</w:t>
             </w:r>
           </w:p>
@@ -6034,7 +6059,6 @@
           <w:p>
             <w:proofErr w:type="spellStart"/>
             <w:r>
-              <w:lastRenderedPageBreak/>
               <w:t>StandardScaler</w:t>
             </w:r>
             <w:proofErr w:type="spellEnd"/>
@@ -6271,6 +6295,7 @@
             <w:proofErr w:type="spellStart"/>
             <w:proofErr w:type="gramStart"/>
             <w:r>
+              <w:lastRenderedPageBreak/>
               <w:t>random</w:t>
             </w:r>
             <w:proofErr w:type="gramEnd"/>
@@ -6541,7 +6566,6 @@
           <w:p>
             <w:proofErr w:type="spellStart"/>
             <w:r>
-              <w:lastRenderedPageBreak/>
               <w:t>Silhouette</w:t>
             </w:r>
             <w:proofErr w:type="spellEnd"/>
@@ -6785,6 +6809,7 @@
           </w:tcPr>
           <w:p>
             <w:r>
+              <w:lastRenderedPageBreak/>
               <w:t>Feature-ruimte bepalen</w:t>
             </w:r>
           </w:p>
@@ -16583,4 +16608,16 @@
     </a:ext>
   </a:extLst>
 </a:theme>
+</file>
+
+<file path=customXml/item1.xml><?xml version="1.0" encoding="utf-8"?>
+<b:Sources xmlns:b="http://schemas.openxmlformats.org/officeDocument/2006/bibliography" xmlns="http://schemas.openxmlformats.org/officeDocument/2006/bibliography" SelectedStyle="\APASixthEditionOfficeOnline.xsl" StyleName="APA" Version="6"/>
+</file>
+
+<file path=customXml/itemProps1.xml><?xml version="1.0" encoding="utf-8"?>
+<ds:datastoreItem xmlns:ds="http://schemas.openxmlformats.org/officeDocument/2006/customXml" ds:itemID="{3DCAA6CD-9C30-4ED1-85C3-3C98D3B48577}">
+  <ds:schemaRefs>
+    <ds:schemaRef ds:uri="http://schemas.openxmlformats.org/officeDocument/2006/bibliography"/>
+  </ds:schemaRefs>
+</ds:datastoreItem>
 </file>
</xml_diff>